<commit_message>
pp-salygos: skyryba šablonuose - socialinių reikalavimų punktas ir „pasiūlymų eilę pateikė“ (K)
Naudotojo prašymas „DPS sąlygų 5.1 punktas“ ir sprendimas taisyti visuose šablonuose. DPS sukūrimo sąlygų 5.1 p. klaidų
neturėjo; DPS konkretaus pirkimo 5.1 p. ir SPS: „kurio pajėgumais remiamasi, privalo“, „t. y. bent vieną“, „ir (arba) bent“,
„kuris pagal sudarytą pasiūlymų eilę pateikė“ - 92 vietos 12 šablonų, žemėlapiai suderinti, pakartotinai - 0. Nekeista:
AK BPS „t. y., ar nėra“ (šalutinis sakinys), tiekėjo formų „(ir/arba)“, angliškas tekstas. Testai 120 (senas šablonas - krenta).

Co-Authored-By: Claude Opus 5.5 <noreply@anthropic.com>
</commit_message>
<xml_diff>
--- a/PP-salygos/templates/AKV_LT_SPS.docx
+++ b/PP-salygos/templates/AKV_LT_SPS.docx
@@ -4451,7 +4451,7 @@
           <w:sz w:val="20"/>
           <w:szCs w:val="20"/>
         </w:rPr>
-        <w:t>, bus prašoma pateikti tik iš Tiekėjo, kuris pagal sudarytą pasiūlymų eilę, pateikė ekonomiškai naudingiausią pasiūlymą.</w:t>
+        <w:t>, bus prašoma pateikti tik iš Tiekėjo, kuris pagal sudarytą pasiūlymų eilę pateikė ekonomiškai naudingiausią pasiūlymą.</w:t>
       </w:r>
     </w:p>
     <w:p>
@@ -4672,7 +4672,7 @@
           <w:sz w:val="20"/>
           <w:szCs w:val="20"/>
         </w:rPr>
-        <w:t>bus prašoma pateikti tik iš Tiekėjo, kuris pagal sudarytą pasiūlymų eilę, pateikė ekonomiškai naudingiausią pasiūlymą</w:t>
+        <w:t>bus prašoma pateikti tik iš Tiekėjo, kuris pagal sudarytą pasiūlymų eilę pateikė ekonomiškai naudingiausią pasiūlymą</w:t>
       </w:r>
       <w:bookmarkEnd w:id="22"/>
       <w:r>
@@ -13137,7 +13137,7 @@
           <w:sz w:val="20"/>
           <w:szCs w:val="20"/>
         </w:rPr>
-        <w:t xml:space="preserve">Tiekėjas arba jo pasitelktas subtiekėjas, arba ūkio subjektas, kurio pajėgumais remiamasi privalo atitikti bent vieną iš socialinių reikalavimų, nurodytų </w:t>
+        <w:t xml:space="preserve">Tiekėjas arba jo pasitelktas subtiekėjas, arba ūkio subjektas, kurio pajėgumais remiamasi, privalo atitikti bent vieną iš socialinių reikalavimų, nurodytų </w:t>
       </w:r>
       <w:r>
         <w:rPr>
@@ -13164,7 +13164,7 @@
           <w:sz w:val="20"/>
           <w:szCs w:val="20"/>
         </w:rPr>
-        <w:t xml:space="preserve"> t. y., bent vieną iš </w:t>
+        <w:t xml:space="preserve"> t. y. bent vieną iš </w:t>
       </w:r>
       <w:r>
         <w:rPr>
@@ -13196,7 +13196,7 @@
           <w:szCs w:val="20"/>
         </w:rPr>
         <w:lastRenderedPageBreak/>
-        <w:t xml:space="preserve">šeimos ir darbo įsipareigojimų derinimo priemonių ir / </w:t>
+        <w:t xml:space="preserve">šeimos ir darbo įsipareigojimų derinimo priemonių ir (a</w:t>
       </w:r>
       <w:r>
         <w:rPr>
@@ -13207,7 +13207,7 @@
           <w:szCs w:val="20"/>
           <w:u w:val="single"/>
         </w:rPr>
-        <w:t>arba</w:t>
+        <w:t>rba)</w:t>
       </w:r>
       <w:r>
         <w:rPr>
@@ -13242,7 +13242,7 @@
           <w:sz w:val="20"/>
           <w:szCs w:val="20"/>
         </w:rPr>
-        <w:t xml:space="preserve"> (vieno ar kelių), bus prašoma pateikti tik iš Tiekėjo, kuris pagal sudarytą pasiūlymų eilę, pateikė ekonomiškai naudingiausią pasiūlymą.</w:t>
+        <w:t xml:space="preserve"> (vieno ar kelių), bus prašoma pateikti tik iš Tiekėjo, kuris pagal sudarytą pasiūlymų eilę pateikė ekonomiškai naudingiausią pasiūlymą.</w:t>
       </w:r>
     </w:p>
     <w:bookmarkEnd w:id="42"/>
@@ -14009,7 +14009,7 @@
                 <w:sz w:val="20"/>
                 <w:szCs w:val="20"/>
               </w:rPr>
-              <w:t>Kitų dokumentų bus prašoma pateikti tik iš Tiekėjo, kuris pagal sudarytą pasiūlymų eilę, pateikė ekonomiškai naudingiausią pasiūlymą:</w:t>
+              <w:t>Kitų dokumentų bus prašoma pateikti tik iš Tiekėjo, kuris pagal sudarytą pasiūlymų eilę pateikė ekonomiškai naudingiausią pasiūlymą:</w:t>
             </w:r>
             <w:r>
               <w:rPr>
@@ -14859,7 +14859,7 @@
                 <w:sz w:val="20"/>
                 <w:szCs w:val="20"/>
               </w:rPr>
-              <w:t>Kitų dokumentų (vieno ar kelių) bus prašoma pateikti tik iš Tiekėjo, kuris pagal sudarytą pasiūlymų eilę, pateikė ekonomiškai naudingiausią pasiūlymą:</w:t>
+              <w:t>Kitų dokumentų (vieno ar kelių) bus prašoma pateikti tik iš Tiekėjo, kuris pagal sudarytą pasiūlymų eilę pateikė ekonomiškai naudingiausią pasiūlymą:</w:t>
             </w:r>
           </w:p>
           <w:p>
@@ -16701,7 +16701,7 @@
                 <w:sz w:val="20"/>
                 <w:szCs w:val="20"/>
               </w:rPr>
-              <w:t xml:space="preserve">bus prašoma pateikti tik iš Tiekėjo, kuris pagal sudarytą pasiūlymų eilę, pateikė ekonomiškai naudingiausią pasiūlymą: Tiekėjo, jo Subtiekėjų, Tiekėjų grupės narių, Ūkio subjektų, kurių pajėgumais remiamasi, </w:t>
+              <w:t xml:space="preserve">bus prašoma pateikti tik iš Tiekėjo, kuris pagal sudarytą pasiūlymų eilę pateikė ekonomiškai naudingiausią pasiūlymą: Tiekėjo, jo Subtiekėjų, Tiekėjų grupės narių, Ūkio subjektų, kurių pajėgumais remiamasi, </w:t>
             </w:r>
             <w:r>
               <w:rPr>

</xml_diff>

<commit_message>
pp-salygos: vidaus taisyklių užtikrinimo riba pašalinta iš 9 šablonų komentarų ir žemėlapių
Naudotojo sprendimas 2026-10-11: grupės iždo politikos užtikrinimo riba - vidinė
informacija, viešuose šablonuose jos neturi būti.

- sablonu-taisymai.py V (_vidine_riba): AK, AKV, SSD, TSD SPS ir DPS konkretaus
  pirkimo sąlygų (LT ir LT/EN) Word komentare prie „Kai taikomas sutarties
  užtikrinimas:“ riba pakeista žodžiais „viršija vidaus taisyklėse nustatytą ribą“;
  tas pats tekstas žemėlapių komentaruTaisykles (2 žingsnio „Šablono autorių
  pastaba“). Pati riba scenarijuje neįrašyta (bendra taisyklė), pakartotinai - 0.
- testas: ribos nėra nė viename šablone ir žemėlapyje; sutarčių šablonų komentarų
  patikra - be skaičiaus.

Co-Authored-By: Claude Opus 5.5 <noreply@anthropic.com>
</commit_message>
<xml_diff>
--- a/PP-salygos/templates/AKV_LT_SPS.docx
+++ b/PP-salygos/templates/AKV_LT_SPS.docx
@@ -24252,7 +24252,7 @@
         <w:rPr>
           <w:u w:val="single"/>
         </w:rPr>
-        <w:t xml:space="preserve">kurių vertė viršija 803 tūkstančius eurų, </w:t>
+        <w:t xml:space="preserve">kurių vertė viršija vidaus taisyklėse nustatytą ribą, </w:t>
       </w:r>
       <w:r>
         <w:t xml:space="preserve">žemesnės vertės pirkimuose taikoma atsižvelgus į įsipareigojimų nevykdymo riziką. Užtikrinimo priemonių pirkimuose, </w:t>
@@ -24261,7 +24261,7 @@
         <w:rPr>
           <w:u w:val="single"/>
         </w:rPr>
-        <w:t>kurių vertė viršija 803 tūkstančius eurų</w:t>
+        <w:t>kurių vertė viršija vidaus taisyklėse nustatytą ribą</w:t>
       </w:r>
       <w:r>
         <w:t xml:space="preserve"> gali būti neprašoma, jeigu Pirkėjas prieš Pirkimą parengia ir pateikia Grupės iždui raštišką argumentaciją, kodėl Užtikrinimo priemonės konkretaus sandorio atžvilgiu nėra tikslingos arba jei, vadovaujantis teisės aktų nuostatomis, yra vykdoma neskelbiamo Pirkimo procedūra iš vienintelio Tiekėjo. Rekomenduojama užtikrinimo vertė nuo pradinės sutarties vertės – ne mažiau nei 10 proc.“. </w:t>

</xml_diff>

<commit_message>
pp-salygos: Word griežtumas sugeneruotuose dokumentuose; BPS kryžminės nuorodos tekstu; deklaracijos A4; rinkinys trimis dalimis
Pages (PDF) ir Word struktūros (ECMA-376) patikra po pernumeravimo: logotipo pastraipos pPr tvarka;
GPDocx.unikalusId įrašant - pasikartojantys w14:paraId (lentelių kopijos dalims), žymės ir piešinių id;
GPDocx.nuorodosTekstu (10f) - REF \r laukai rodomu tekstu (Word atnaujindamas laukus skaičiuotų iš žymių,
ND LT/EN BPS šablone jos ne tose eilutėse); sablonu-taisymai.py AI - AKV LT SPS rPr tvarka, ND LT/EN BPS
nukopijuota žymė, nacionalinio saugumo deklaracijų Letter -> A4. testaiWord (4), rinkinys - 3 dalys.

Co-Authored-By: Claude Opus 5.5 <noreply@anthropic.com>
</commit_message>
<xml_diff>
--- a/PP-salygos/templates/AKV_LT_SPS.docx
+++ b/PP-salygos/templates/AKV_LT_SPS.docx
@@ -11796,9 +11796,9 @@
       <w:r>
         <w:rPr>
           <w:rFonts w:ascii="Arial" w:hAnsi="Arial" w:cs="Arial"/>
-          <w:sz w:val="20"/>
-          <w:szCs w:val="20"/>
           <w:color w:val="FF0000"/>
+          <w:sz w:val="20"/>
+          <w:szCs w:val="20"/>
         </w:rPr>
         <w:t xml:space="preserve">X, X, X </w:t>
       </w:r>
@@ -11813,9 +11813,9 @@
       <w:r>
         <w:rPr>
           <w:rFonts w:ascii="Arial" w:hAnsi="Arial" w:cs="Arial"/>
-          <w:sz w:val="20"/>
-          <w:szCs w:val="20"/>
           <w:color w:val="FF0000"/>
+          <w:sz w:val="20"/>
+          <w:szCs w:val="20"/>
         </w:rPr>
         <w:t xml:space="preserve">X</w:t>
       </w:r>
@@ -11830,9 +11830,9 @@
       <w:r>
         <w:rPr>
           <w:rFonts w:ascii="Arial" w:hAnsi="Arial" w:cs="Arial"/>
-          <w:sz w:val="20"/>
-          <w:szCs w:val="20"/>
           <w:color w:val="FF0000"/>
+          <w:sz w:val="20"/>
+          <w:szCs w:val="20"/>
         </w:rPr>
         <w:t xml:space="preserve">X</w:t>
       </w:r>
@@ -11847,9 +11847,9 @@
       <w:r>
         <w:rPr>
           <w:rFonts w:ascii="Arial" w:hAnsi="Arial" w:cs="Arial"/>
-          <w:sz w:val="20"/>
-          <w:szCs w:val="20"/>
           <w:color w:val="FF0000"/>
+          <w:sz w:val="20"/>
+          <w:szCs w:val="20"/>
         </w:rPr>
         <w:t xml:space="preserve">X</w:t>
       </w:r>
@@ -11864,9 +11864,9 @@
       <w:r>
         <w:rPr>
           <w:rFonts w:ascii="Arial" w:hAnsi="Arial" w:cs="Arial"/>
-          <w:sz w:val="20"/>
-          <w:szCs w:val="20"/>
           <w:color w:val="FF0000"/>
+          <w:sz w:val="20"/>
+          <w:szCs w:val="20"/>
         </w:rPr>
         <w:t xml:space="preserve">X</w:t>
       </w:r>
@@ -11881,9 +11881,9 @@
       <w:r>
         <w:rPr>
           <w:rFonts w:ascii="Arial" w:hAnsi="Arial" w:cs="Arial"/>
-          <w:sz w:val="20"/>
-          <w:szCs w:val="20"/>
           <w:color w:val="FF0000"/>
+          <w:sz w:val="20"/>
+          <w:szCs w:val="20"/>
         </w:rPr>
         <w:t xml:space="preserve">X</w:t>
       </w:r>

</xml_diff>